<commit_message>
docs: update du persona "Mme Lefèvre"
</commit_message>
<xml_diff>
--- a/docs/cadrage/equipe-1-personas.docx
+++ b/docs/cadrage/equipe-1-personas.docx
@@ -10022,7 +10022,7 @@
                 <w:noProof/>
               </w:rPr>
               <w:drawing>
-                <wp:inline distT="0" distB="0" distL="0" distR="0" wp14:anchorId="1B76D9A6" wp14:editId="0837A585">
+                <wp:inline distT="0" distB="0" distL="0" distR="0" wp14:anchorId="1B76D9A6" wp14:editId="0F880989">
                   <wp:extent cx="114300" cy="122297"/>
                   <wp:effectExtent l="0" t="0" r="0" b="0"/>
                   <wp:docPr id="1416745198" name="Image 7"/>
@@ -11691,6 +11691,114 @@
     </w:p>
     <w:p>
       <w:pPr>
+        <w:pStyle w:val="Paragraphedeliste"/>
+        <w:numPr>
+          <w:ilvl w:val="2"/>
+          <w:numId w:val="30"/>
+        </w:numPr>
+        <w:tabs>
+          <w:tab w:val="left" w:pos="720"/>
+        </w:tabs>
+        <w:spacing w:before="50"/>
+        <w:ind w:left="720" w:hanging="360"/>
+      </w:pPr>
+      <w:r>
+        <w:t>•</w:t>
+      </w:r>
+      <w:r>
+        <w:rPr>
+          <w:spacing w:val="-4"/>
+        </w:rPr>
+        <w:t xml:space="preserve"> </w:t>
+      </w:r>
+      <w:r>
+        <w:t>Ne repère pas l'étudiant qui décroche en cours de semestre : elle s'en aperçoit souvent le jour de l'examen, trop tard pour réagir</w:t>
+      </w:r>
+      <w:r>
+        <w:rPr>
+          <w:spacing w:val="-5"/>
+        </w:rPr>
+      </w:r>
+      <w:r/>
+      <w:r>
+        <w:rPr>
+          <w:spacing w:val="-5"/>
+        </w:rPr>
+      </w:r>
+      <w:r/>
+      <w:r>
+        <w:rPr>
+          <w:spacing w:val="-1"/>
+        </w:rPr>
+      </w:r>
+      <w:r/>
+      <w:r>
+        <w:rPr>
+          <w:spacing w:val="-5"/>
+        </w:rPr>
+      </w:r>
+      <w:r/>
+      <w:r>
+        <w:rPr>
+          <w:spacing w:val="-5"/>
+        </w:rPr>
+      </w:r>
+      <w:r/>
+      <w:r>
+        <w:rPr>
+          <w:spacing w:val="-2"/>
+        </w:rPr>
+      </w:r>
+      <w:r/>
+      <w:r>
+        <w:rPr>
+          <w:spacing w:val="-1"/>
+        </w:rPr>
+      </w:r>
+      <w:r/>
+      <w:r>
+        <w:rPr>
+          <w:spacing w:val="-5"/>
+        </w:rPr>
+      </w:r>
+      <w:r/>
+      <w:r>
+        <w:rPr>
+          <w:spacing w:val="-2"/>
+        </w:rPr>
+      </w:r>
+      <w:r/>
+      <w:r>
+        <w:rPr>
+          <w:spacing w:val="-4"/>
+        </w:rPr>
+      </w:r>
+      <w:r/>
+      <w:r>
+        <w:rPr>
+          <w:spacing w:val="-4"/>
+        </w:rPr>
+      </w:r>
+      <w:r/>
+      <w:r>
+        <w:rPr>
+          <w:spacing w:val="-1"/>
+        </w:rPr>
+      </w:r>
+      <w:r/>
+      <w:r>
+        <w:rPr>
+          <w:spacing w:val="-1"/>
+        </w:rPr>
+      </w:r>
+      <w:r>
+        <w:rPr>
+          <w:spacing w:val="-4"/>
+        </w:rPr>
+      </w:r>
+    </w:p>
+    <w:p>
+      <w:pPr>
         <w:pStyle w:val="Titre3"/>
         <w:numPr>
           <w:ilvl w:val="1"/>
@@ -12152,6 +12260,114 @@
       </w:r>
       <w:r>
         <w:t>Réduire son temps de correction de 12h à moins de 4h/mois grâce à l'auto-correction des QCM d'ici la fin du semestre</w:t>
+      </w:r>
+    </w:p>
+    <w:p>
+      <w:pPr>
+        <w:pStyle w:val="Paragraphedeliste"/>
+        <w:numPr>
+          <w:ilvl w:val="2"/>
+          <w:numId w:val="30"/>
+        </w:numPr>
+        <w:tabs>
+          <w:tab w:val="left" w:pos="720"/>
+        </w:tabs>
+        <w:spacing w:before="50"/>
+        <w:ind w:left="720" w:hanging="360"/>
+      </w:pPr>
+      <w:r>
+        <w:t>•</w:t>
+      </w:r>
+      <w:r>
+        <w:rPr>
+          <w:spacing w:val="-4"/>
+        </w:rPr>
+        <w:t xml:space="preserve"> </w:t>
+      </w:r>
+      <w:r>
+        <w:t>Identifier en cours de semestre les étudiants à risque (score en baisse) et leur envoyer un conseil de révision ciblé avant l'examen</w:t>
+      </w:r>
+      <w:r>
+        <w:rPr>
+          <w:spacing w:val="-5"/>
+        </w:rPr>
+      </w:r>
+      <w:r/>
+      <w:r>
+        <w:rPr>
+          <w:spacing w:val="-5"/>
+        </w:rPr>
+      </w:r>
+      <w:r/>
+      <w:r>
+        <w:rPr>
+          <w:spacing w:val="-1"/>
+        </w:rPr>
+      </w:r>
+      <w:r/>
+      <w:r>
+        <w:rPr>
+          <w:spacing w:val="-5"/>
+        </w:rPr>
+      </w:r>
+      <w:r/>
+      <w:r>
+        <w:rPr>
+          <w:spacing w:val="-5"/>
+        </w:rPr>
+      </w:r>
+      <w:r/>
+      <w:r>
+        <w:rPr>
+          <w:spacing w:val="-2"/>
+        </w:rPr>
+      </w:r>
+      <w:r/>
+      <w:r>
+        <w:rPr>
+          <w:spacing w:val="-1"/>
+        </w:rPr>
+      </w:r>
+      <w:r/>
+      <w:r>
+        <w:rPr>
+          <w:spacing w:val="-5"/>
+        </w:rPr>
+      </w:r>
+      <w:r/>
+      <w:r>
+        <w:rPr>
+          <w:spacing w:val="-2"/>
+        </w:rPr>
+      </w:r>
+      <w:r/>
+      <w:r>
+        <w:rPr>
+          <w:spacing w:val="-4"/>
+        </w:rPr>
+      </w:r>
+      <w:r/>
+      <w:r>
+        <w:rPr>
+          <w:spacing w:val="-4"/>
+        </w:rPr>
+      </w:r>
+      <w:r/>
+      <w:r>
+        <w:rPr>
+          <w:spacing w:val="-1"/>
+        </w:rPr>
+      </w:r>
+      <w:r/>
+      <w:r>
+        <w:rPr>
+          <w:spacing w:val="-1"/>
+        </w:rPr>
+      </w:r>
+      <w:r>
+        <w:rPr>
+          <w:spacing w:val="-4"/>
+        </w:rPr>
       </w:r>
     </w:p>
     <w:p>
@@ -15992,16 +16208,6 @@
     <w:p>
       <w:pPr>
         <w:pStyle w:val="Paragraphedeliste"/>
-        <w:sectPr>
-          <w:pgSz w:w="12240" w:h="15840"/>
-          <w:pgMar w:top="1360" w:right="1440" w:bottom="880" w:left="1440" w:header="0" w:footer="700" w:gutter="0"/>
-          <w:cols w:space="720"/>
-        </w:sectPr>
-      </w:pPr>
-    </w:p>
-    <w:p>
-      <w:pPr>
-        <w:pStyle w:val="Paragraphedeliste"/>
         <w:numPr>
           <w:ilvl w:val="2"/>
           <w:numId w:val="32"/>
@@ -16013,7 +16219,6 @@
         <w:ind w:right="711"/>
       </w:pPr>
       <w:r>
-        <w:lastRenderedPageBreak/>
         <w:t>•</w:t>
       </w:r>
       <w:r>
@@ -17579,6 +17784,7 @@
           <w:color w:val="F59E0A"/>
           <w:sz w:val="18"/>
         </w:rPr>
+        <w:lastRenderedPageBreak/>
         <w:t>💡</w:t>
       </w:r>
       <w:r>
@@ -19136,7 +19342,6 @@
         <w:rPr>
           <w:b/>
         </w:rPr>
-        <w:lastRenderedPageBreak/>
         <w:t>Enseignant·e</w:t>
       </w:r>
       <w:proofErr w:type="spellEnd"/>
@@ -19412,348 +19617,330 @@
     </w:p>
     <w:p>
       <w:pPr>
+        <w:spacing w:before="82" w:line="273" w:lineRule="auto"/>
+        <w:ind w:right="369"/>
+        <w:rPr>
+          <w:i/>
+        </w:rPr>
+      </w:pPr>
+      <w:r>
+        <w:rPr>
+          <w:b/>
+        </w:rPr>
+        <w:t>École</w:t>
+      </w:r>
+      <w:r>
+        <w:rPr>
+          <w:b/>
+          <w:spacing w:val="-5"/>
+        </w:rPr>
+        <w:t xml:space="preserve"> </w:t>
+      </w:r>
+      <w:r>
+        <w:rPr>
+          <w:b/>
+        </w:rPr>
+        <w:t>internationale</w:t>
+      </w:r>
+      <w:r>
+        <w:rPr>
+          <w:b/>
+          <w:spacing w:val="-5"/>
+        </w:rPr>
+        <w:t xml:space="preserve"> </w:t>
+      </w:r>
+      <w:r>
+        <w:rPr>
+          <w:b/>
+        </w:rPr>
+        <w:t>tournée</w:t>
+      </w:r>
+      <w:r>
+        <w:rPr>
+          <w:b/>
+          <w:spacing w:val="-5"/>
+        </w:rPr>
+        <w:t xml:space="preserve"> </w:t>
+      </w:r>
+      <w:r>
+        <w:rPr>
+          <w:b/>
+        </w:rPr>
+        <w:t>vers</w:t>
+      </w:r>
+      <w:r>
+        <w:rPr>
+          <w:b/>
+          <w:spacing w:val="-4"/>
+        </w:rPr>
+        <w:t xml:space="preserve"> </w:t>
+      </w:r>
+      <w:r>
+        <w:rPr>
+          <w:b/>
+        </w:rPr>
+        <w:t>OpenAI</w:t>
+      </w:r>
+      <w:r>
+        <w:rPr>
+          <w:b/>
+          <w:spacing w:val="-4"/>
+        </w:rPr>
+        <w:t xml:space="preserve"> </w:t>
+      </w:r>
+      <w:r>
+        <w:rPr>
+          <w:b/>
+        </w:rPr>
+        <w:t>/</w:t>
+      </w:r>
+      <w:r>
+        <w:rPr>
+          <w:b/>
+          <w:spacing w:val="-5"/>
+        </w:rPr>
+        <w:t xml:space="preserve"> </w:t>
+      </w:r>
+      <w:proofErr w:type="spellStart"/>
+      <w:r>
+        <w:rPr>
+          <w:b/>
+        </w:rPr>
+        <w:t>Anthropic</w:t>
+      </w:r>
+      <w:proofErr w:type="spellEnd"/>
+      <w:r>
+        <w:rPr>
+          <w:b/>
+        </w:rPr>
+        <w:t>,</w:t>
+      </w:r>
+      <w:r>
+        <w:rPr>
+          <w:b/>
+          <w:spacing w:val="-2"/>
+        </w:rPr>
+        <w:t xml:space="preserve"> </w:t>
+      </w:r>
+      <w:r>
+        <w:rPr>
+          <w:b/>
+        </w:rPr>
+        <w:t>sans</w:t>
+      </w:r>
+      <w:r>
+        <w:rPr>
+          <w:b/>
+          <w:spacing w:val="-4"/>
+        </w:rPr>
+        <w:t xml:space="preserve"> </w:t>
+      </w:r>
+      <w:r>
+        <w:rPr>
+          <w:b/>
+        </w:rPr>
+        <w:t>contrainte</w:t>
+      </w:r>
+      <w:r>
+        <w:rPr>
+          <w:b/>
+          <w:spacing w:val="-5"/>
+        </w:rPr>
+        <w:t xml:space="preserve"> </w:t>
+      </w:r>
+      <w:r>
+        <w:rPr>
+          <w:b/>
+        </w:rPr>
+        <w:t xml:space="preserve">RGPD. </w:t>
+      </w:r>
+      <w:r>
+        <w:rPr>
+          <w:i/>
+        </w:rPr>
+        <w:t>Notre différenciation est précisément le local-first et la souveraineté des données. Une école qu</w:t>
+      </w:r>
+      <w:r>
+        <w:rPr>
+          <w:i/>
+        </w:rPr>
+        <w:t xml:space="preserve">i </w:t>
+      </w:r>
+      <w:r>
+        <w:rPr>
+          <w:i/>
+        </w:rPr>
+        <w:t>valorise</w:t>
+      </w:r>
+      <w:r>
+        <w:rPr>
+          <w:i/>
+          <w:spacing w:val="-4"/>
+        </w:rPr>
+        <w:t xml:space="preserve"> </w:t>
+      </w:r>
+      <w:r>
+        <w:rPr>
+          <w:i/>
+        </w:rPr>
+        <w:t>un</w:t>
+      </w:r>
+      <w:r>
+        <w:rPr>
+          <w:i/>
+          <w:spacing w:val="-2"/>
+        </w:rPr>
+        <w:t xml:space="preserve"> </w:t>
+      </w:r>
+      <w:r>
+        <w:rPr>
+          <w:i/>
+        </w:rPr>
+        <w:t>partenariat</w:t>
+      </w:r>
+      <w:r>
+        <w:rPr>
+          <w:i/>
+          <w:spacing w:val="-3"/>
+        </w:rPr>
+        <w:t xml:space="preserve"> </w:t>
+      </w:r>
+      <w:r>
+        <w:rPr>
+          <w:i/>
+        </w:rPr>
+        <w:t>OpenAI</w:t>
+      </w:r>
+      <w:r>
+        <w:rPr>
+          <w:i/>
+          <w:spacing w:val="-2"/>
+        </w:rPr>
+        <w:t xml:space="preserve"> </w:t>
+      </w:r>
+      <w:r>
+        <w:rPr>
+          <w:i/>
+        </w:rPr>
+        <w:t>n'achètera</w:t>
+      </w:r>
+      <w:r>
+        <w:rPr>
+          <w:i/>
+          <w:spacing w:val="-4"/>
+        </w:rPr>
+        <w:t xml:space="preserve"> </w:t>
+      </w:r>
+      <w:r>
+        <w:rPr>
+          <w:i/>
+        </w:rPr>
+        <w:t>jamais</w:t>
+      </w:r>
+      <w:r>
+        <w:rPr>
+          <w:i/>
+          <w:spacing w:val="-2"/>
+        </w:rPr>
+        <w:t xml:space="preserve"> </w:t>
+      </w:r>
+      <w:proofErr w:type="spellStart"/>
+      <w:r>
+        <w:rPr>
+          <w:i/>
+        </w:rPr>
+        <w:t>EduTutor</w:t>
+      </w:r>
+      <w:proofErr w:type="spellEnd"/>
+      <w:r>
+        <w:rPr>
+          <w:i/>
+        </w:rPr>
+        <w:t>,</w:t>
+      </w:r>
+      <w:r>
+        <w:rPr>
+          <w:i/>
+          <w:spacing w:val="-4"/>
+        </w:rPr>
+        <w:t xml:space="preserve"> </w:t>
+      </w:r>
+      <w:r>
+        <w:rPr>
+          <w:i/>
+        </w:rPr>
+        <w:t>et</w:t>
+      </w:r>
+      <w:r>
+        <w:rPr>
+          <w:i/>
+          <w:spacing w:val="-3"/>
+        </w:rPr>
+        <w:t xml:space="preserve"> </w:t>
+      </w:r>
+      <w:r>
+        <w:rPr>
+          <w:i/>
+        </w:rPr>
+        <w:t>inversement,</w:t>
+      </w:r>
+      <w:r>
+        <w:rPr>
+          <w:i/>
+          <w:spacing w:val="-4"/>
+        </w:rPr>
+        <w:t xml:space="preserve"> </w:t>
+      </w:r>
+      <w:r>
+        <w:rPr>
+          <w:i/>
+        </w:rPr>
+        <w:t>ce</w:t>
+      </w:r>
+      <w:r>
+        <w:rPr>
+          <w:i/>
+          <w:spacing w:val="-3"/>
+        </w:rPr>
+        <w:t xml:space="preserve"> </w:t>
+      </w:r>
+      <w:r>
+        <w:rPr>
+          <w:i/>
+        </w:rPr>
+        <w:t>n'est</w:t>
+      </w:r>
+      <w:r>
+        <w:rPr>
+          <w:i/>
+          <w:spacing w:val="-3"/>
+        </w:rPr>
+        <w:t xml:space="preserve"> </w:t>
+      </w:r>
+      <w:r>
+        <w:rPr>
+          <w:i/>
+        </w:rPr>
+        <w:t>pas</w:t>
+      </w:r>
+      <w:r>
+        <w:rPr>
+          <w:i/>
+          <w:spacing w:val="-6"/>
+        </w:rPr>
+        <w:t xml:space="preserve"> </w:t>
+      </w:r>
+      <w:r>
+        <w:rPr>
+          <w:i/>
+        </w:rPr>
+        <w:t>un marché à courir.</w:t>
+      </w:r>
+    </w:p>
+    <w:p>
+      <w:pPr>
         <w:spacing w:before="52" w:line="276" w:lineRule="auto"/>
         <w:ind w:left="360"/>
-        <w:rPr>
-          <w:i/>
-        </w:rPr>
-      </w:pPr>
-      <w:r>
-        <w:rPr>
-          <w:b/>
-        </w:rPr>
-        <w:t>École</w:t>
-      </w:r>
-      <w:r>
-        <w:rPr>
-          <w:b/>
-          <w:spacing w:val="-5"/>
-        </w:rPr>
-        <w:t xml:space="preserve"> </w:t>
-      </w:r>
-      <w:r>
-        <w:rPr>
-          <w:b/>
-        </w:rPr>
-        <w:t>internationale</w:t>
-      </w:r>
-      <w:r>
-        <w:rPr>
-          <w:b/>
-          <w:spacing w:val="-5"/>
-        </w:rPr>
-        <w:t xml:space="preserve"> </w:t>
-      </w:r>
-      <w:r>
-        <w:rPr>
-          <w:b/>
-        </w:rPr>
-        <w:t>tournée</w:t>
-      </w:r>
-      <w:r>
-        <w:rPr>
-          <w:b/>
-          <w:spacing w:val="-5"/>
-        </w:rPr>
-        <w:t xml:space="preserve"> </w:t>
-      </w:r>
-      <w:r>
-        <w:rPr>
-          <w:b/>
-        </w:rPr>
-        <w:t>vers</w:t>
-      </w:r>
-      <w:r>
-        <w:rPr>
-          <w:b/>
-          <w:spacing w:val="-4"/>
-        </w:rPr>
-        <w:t xml:space="preserve"> </w:t>
-      </w:r>
-      <w:r>
-        <w:rPr>
-          <w:b/>
-        </w:rPr>
-        <w:t>OpenAI</w:t>
-      </w:r>
-      <w:r>
-        <w:rPr>
-          <w:b/>
-          <w:spacing w:val="-4"/>
-        </w:rPr>
-        <w:t xml:space="preserve"> </w:t>
-      </w:r>
-      <w:r>
-        <w:rPr>
-          <w:b/>
-        </w:rPr>
-        <w:t>/</w:t>
-      </w:r>
-      <w:r>
-        <w:rPr>
-          <w:b/>
-          <w:spacing w:val="-5"/>
-        </w:rPr>
-        <w:t xml:space="preserve"> </w:t>
-      </w:r>
-      <w:proofErr w:type="spellStart"/>
-      <w:r>
-        <w:rPr>
-          <w:b/>
-        </w:rPr>
-        <w:t>Anthropic</w:t>
-      </w:r>
-      <w:proofErr w:type="spellEnd"/>
-      <w:r>
-        <w:rPr>
-          <w:b/>
-        </w:rPr>
-        <w:t>,</w:t>
-      </w:r>
-      <w:r>
-        <w:rPr>
-          <w:b/>
-          <w:spacing w:val="-2"/>
-        </w:rPr>
-        <w:t xml:space="preserve"> </w:t>
-      </w:r>
-      <w:r>
-        <w:rPr>
-          <w:b/>
-        </w:rPr>
-        <w:t>sans</w:t>
-      </w:r>
-      <w:r>
-        <w:rPr>
-          <w:b/>
-          <w:spacing w:val="-4"/>
-        </w:rPr>
-        <w:t xml:space="preserve"> </w:t>
-      </w:r>
-      <w:r>
-        <w:rPr>
-          <w:b/>
-        </w:rPr>
-        <w:t>contrainte</w:t>
-      </w:r>
-      <w:r>
-        <w:rPr>
-          <w:b/>
-          <w:spacing w:val="-5"/>
-        </w:rPr>
-        <w:t xml:space="preserve"> </w:t>
-      </w:r>
-      <w:r>
-        <w:rPr>
-          <w:b/>
-        </w:rPr>
-        <w:t xml:space="preserve">RGPD. </w:t>
-      </w:r>
-      <w:r>
-        <w:rPr>
-          <w:i/>
-        </w:rPr>
-        <w:t>Notre différenciation est précisément le local-first et la souveraineté des données. Une école qui</w:t>
-      </w:r>
-    </w:p>
-    <w:p>
-      <w:pPr>
-        <w:spacing w:line="276" w:lineRule="auto"/>
-        <w:rPr>
-          <w:i/>
-        </w:rPr>
-        <w:sectPr>
-          <w:pgSz w:w="12240" w:h="15840"/>
-          <w:pgMar w:top="1360" w:right="1440" w:bottom="880" w:left="1440" w:header="0" w:footer="700" w:gutter="0"/>
-          <w:cols w:space="720"/>
-        </w:sectPr>
-      </w:pPr>
-    </w:p>
-    <w:p>
-      <w:pPr>
-        <w:spacing w:before="82" w:line="273" w:lineRule="auto"/>
-        <w:ind w:left="360" w:right="369"/>
-        <w:rPr>
-          <w:i/>
-        </w:rPr>
-      </w:pPr>
-      <w:proofErr w:type="gramStart"/>
-      <w:r>
-        <w:rPr>
-          <w:i/>
-        </w:rPr>
-        <w:lastRenderedPageBreak/>
-        <w:t>valorise</w:t>
-      </w:r>
-      <w:proofErr w:type="gramEnd"/>
-      <w:r>
-        <w:rPr>
-          <w:i/>
-          <w:spacing w:val="-4"/>
-        </w:rPr>
-        <w:t xml:space="preserve"> </w:t>
-      </w:r>
-      <w:r>
-        <w:rPr>
-          <w:i/>
-        </w:rPr>
-        <w:t>un</w:t>
-      </w:r>
-      <w:r>
-        <w:rPr>
-          <w:i/>
-          <w:spacing w:val="-2"/>
-        </w:rPr>
-        <w:t xml:space="preserve"> </w:t>
-      </w:r>
-      <w:r>
-        <w:rPr>
-          <w:i/>
-        </w:rPr>
-        <w:t>partenariat</w:t>
-      </w:r>
-      <w:r>
-        <w:rPr>
-          <w:i/>
-          <w:spacing w:val="-3"/>
-        </w:rPr>
-        <w:t xml:space="preserve"> </w:t>
-      </w:r>
-      <w:r>
-        <w:rPr>
-          <w:i/>
-        </w:rPr>
-        <w:t>OpenAI</w:t>
-      </w:r>
-      <w:r>
-        <w:rPr>
-          <w:i/>
-          <w:spacing w:val="-2"/>
-        </w:rPr>
-        <w:t xml:space="preserve"> </w:t>
-      </w:r>
-      <w:r>
-        <w:rPr>
-          <w:i/>
-        </w:rPr>
-        <w:t>n'achètera</w:t>
-      </w:r>
-      <w:r>
-        <w:rPr>
-          <w:i/>
-          <w:spacing w:val="-4"/>
-        </w:rPr>
-        <w:t xml:space="preserve"> </w:t>
-      </w:r>
-      <w:r>
-        <w:rPr>
-          <w:i/>
-        </w:rPr>
-        <w:t>jamais</w:t>
-      </w:r>
-      <w:r>
-        <w:rPr>
-          <w:i/>
-          <w:spacing w:val="-2"/>
-        </w:rPr>
-        <w:t xml:space="preserve"> </w:t>
-      </w:r>
-      <w:proofErr w:type="spellStart"/>
-      <w:r>
-        <w:rPr>
-          <w:i/>
-        </w:rPr>
-        <w:t>EduTutor</w:t>
-      </w:r>
-      <w:proofErr w:type="spellEnd"/>
-      <w:r>
-        <w:rPr>
-          <w:i/>
-        </w:rPr>
-        <w:t>,</w:t>
-      </w:r>
-      <w:r>
-        <w:rPr>
-          <w:i/>
-          <w:spacing w:val="-4"/>
-        </w:rPr>
-        <w:t xml:space="preserve"> </w:t>
-      </w:r>
-      <w:r>
-        <w:rPr>
-          <w:i/>
-        </w:rPr>
-        <w:t>et</w:t>
-      </w:r>
-      <w:r>
-        <w:rPr>
-          <w:i/>
-          <w:spacing w:val="-3"/>
-        </w:rPr>
-        <w:t xml:space="preserve"> </w:t>
-      </w:r>
-      <w:r>
-        <w:rPr>
-          <w:i/>
-        </w:rPr>
-        <w:t>inversement,</w:t>
-      </w:r>
-      <w:r>
-        <w:rPr>
-          <w:i/>
-          <w:spacing w:val="-4"/>
-        </w:rPr>
-        <w:t xml:space="preserve"> </w:t>
-      </w:r>
-      <w:r>
-        <w:rPr>
-          <w:i/>
-        </w:rPr>
-        <w:t>ce</w:t>
-      </w:r>
-      <w:r>
-        <w:rPr>
-          <w:i/>
-          <w:spacing w:val="-3"/>
-        </w:rPr>
-        <w:t xml:space="preserve"> </w:t>
-      </w:r>
-      <w:r>
-        <w:rPr>
-          <w:i/>
-        </w:rPr>
-        <w:t>n'est</w:t>
-      </w:r>
-      <w:r>
-        <w:rPr>
-          <w:i/>
-          <w:spacing w:val="-3"/>
-        </w:rPr>
-        <w:t xml:space="preserve"> </w:t>
-      </w:r>
-      <w:r>
-        <w:rPr>
-          <w:i/>
-        </w:rPr>
-        <w:t>pas</w:t>
-      </w:r>
-      <w:r>
-        <w:rPr>
-          <w:i/>
-          <w:spacing w:val="-6"/>
-        </w:rPr>
-        <w:t xml:space="preserve"> </w:t>
-      </w:r>
-      <w:r>
-        <w:rPr>
-          <w:i/>
-        </w:rPr>
-        <w:t>un marché à courir.</w:t>
-      </w:r>
-    </w:p>
-    <w:p>
-      <w:pPr>
-        <w:spacing w:line="273" w:lineRule="auto"/>
         <w:rPr>
           <w:i/>
         </w:rPr>
@@ -28818,6 +29005,7 @@
   <w:style w:type="character" w:default="1" w:styleId="Policepardfaut">
     <w:name w:val="Default Paragraph Font"/>
     <w:uiPriority w:val="1"/>
+    <w:semiHidden/>
     <w:unhideWhenUsed/>
   </w:style>
   <w:style w:type="table" w:default="1" w:styleId="TableauNormal">

</xml_diff>